<commit_message>
fix: KZ-Startwerte pro Budget-Tier neu balanciert (50/42/34)
kz_start pro Tier gesenkt (vorher 70/60/50), damit KZ=100 ein echter
Erfolg statt Standardergebnis ist: volle Enumeration zeigte vorher
73-80% KZ=100 je Tier, nach der Anpassung liegen alle drei Tiers bei
~14-16%, bei vergleichbarem Mittelwert (~88-90) ueber die Tiers hinweg.

- Budget.docx-Tabelle entsprechend aktualisiert
- Veraltete Vor-Rebalance-Simulationsdaten (sim_*.json,
  simulation_results*.json, Stand Januar 2026) und die dazugehoerigen
  Referenzblaetter (docs/mitigation_bewertungsblatt.md,
  docs/cia_schnellreferenz.md, nutzen noch das alte e_divisor-Formelsystem
  und laengst ersetzte Events) nach archive/ verschoben statt geloescht

Co-Authored-By: Claude Sonnet 5 <noreply@anthropic.com>
</commit_message>
<xml_diff>
--- a/final_documents/Budget.docx
+++ b/final_documents/Budget.docx
@@ -838,7 +838,7 @@
                 <w:highlight w:val="none"/>
                 <w:lang w:val="de-DE"/>
               </w:rPr>
-              <w:t xml:space="preserve">70</w:t>
+              <w:t>50</w:t>
             </w:r>
             <w:r>
               <w:rPr>
@@ -959,7 +959,7 @@
                 <w:highlight w:val="none"/>
                 <w:lang w:val="de-DE"/>
               </w:rPr>
-              <w:t xml:space="preserve">60</w:t>
+              <w:t>42</w:t>
             </w:r>
             <w:r>
               <w:rPr>
@@ -1092,7 +1092,7 @@
                 <w:highlight w:val="none"/>
                 <w:lang w:val="de-DE" w:bidi="de-DE"/>
               </w:rPr>
-              <w:t xml:space="preserve">50</w:t>
+              <w:t>34</w:t>
             </w:r>
             <w:r>
               <w:rPr>

</xml_diff>